<commit_message>
Actualización de tareas binario 1 y 2 MME
</commit_message>
<xml_diff>
--- a/MME/ejercicio decimal binario y viceversa.docx
+++ b/MME/ejercicio decimal binario y viceversa.docx
@@ -588,7 +588,7 @@
       </w:pPr>
       <w:r>
         <w:rPr/>
-        <w:t xml:space="preserve">18₁₀ = 10010</w:t>
+        <w:t xml:space="preserve">18₁₀ = 10010n</w:t>
       </w:r>
     </w:p>
     <w:p>
@@ -705,7 +705,7 @@
       </w:pPr>
       <w:r>
         <w:rPr/>
-        <w:t xml:space="preserve">73₁₀ = 1001010</w:t>
+        <w:t xml:space="preserve">73₁₀ = 1001001</w:t>
       </w:r>
     </w:p>
     <w:p>
@@ -718,7 +718,7 @@
       </w:pPr>
       <w:r>
         <w:rPr/>
-        <w:t xml:space="preserve">86₁₀ = 1011010</w:t>
+        <w:t xml:space="preserve">86₁₀ = 1010110</w:t>
       </w:r>
     </w:p>
     <w:p>
@@ -757,7 +757,7 @@
       </w:pPr>
       <w:r>
         <w:rPr/>
-        <w:t xml:space="preserve">150₁₀ = 10100000</w:t>
+        <w:t xml:space="preserve">150₁₀ = 10010110</w:t>
       </w:r>
     </w:p>
     <w:p>

</xml_diff>